<commit_message>
docs: 同步实测数字——55 passed+3 skipped，RAG R@5=1.0/MRR=0.759，96 条评测
</commit_message>
<xml_diff>
--- a/docs/项目自述-从第一性原理到落地.docx
+++ b/docs/项目自述-从第一性原理到落地.docx
@@ -1489,7 +1489,7 @@
                 <w:rFonts w:ascii="微软雅黑" w:hAnsi="微软雅黑" w:eastAsia="微软雅黑"/>
                 <w:b/>
               </w:rPr>
-              <w:t>0.990</w:t>
+              <w:t>1.000</w:t>
             </w:r>
             <w:r>
               <w:rPr>
@@ -1514,7 +1514,7 @@
                 <w:rFonts w:ascii="微软雅黑" w:hAnsi="微软雅黑" w:eastAsia="微软雅黑"/>
                 <w:b/>
               </w:rPr>
-              <w:t>0.748</w:t>
+              <w:t>0.759</w:t>
             </w:r>
             <w:r>
               <w:rPr>
@@ -2202,7 +2202,7 @@
         <w:rPr>
           <w:rFonts w:ascii="微软雅黑" w:hAnsi="微软雅黑" w:eastAsia="微软雅黑"/>
         </w:rPr>
-        <w:t>我写了 9 个单元测试文件 + 20 个 e2e 测试文件，共 54 个用例（本地跑 51 passed + 3 skipped，3 个是需要 Docker 的集成测试）：ReAct 循环真测试、dry-run 门、FRR 集成测试（标了 mark，CI 里跳过）、各种离谱输入的鲁棒性测试。</w:t>
+        <w:t>我写了 9 个单元测试文件 + 20 个 e2e 测试文件，共 58 个用例（本地跑 55 passed + 3 skipped，3 个是需要 Docker 的集成测试）：ReAct 循环真测试、dry-run 门、FRR 集成测试（标了 mark，CI 里跳过）、各种离谱输入的鲁棒性测试。</w:t>
       </w:r>
     </w:p>
     <w:p>

</xml_diff>